<commit_message>
Met a jour le plan : decision de persistance actee (Supabase)
Suite a la clarification de l'equipe (22 aout) : vraie persistance
requise, pas juste pendant la session. Consequence technique
documentee (systeme de fichiers ephemere sur Streamlit Cloud, base
hebergee necessaire) et calendrier recale en consequence :
- Bloc Marie-Therese : migration vers Supabase (Postgres) au lieu
  d'une simple consolidation SQLite locale, +1 jour au total.
- Bloc Aristide (integration style) decale en consequence
  (ven 28 apres-midi - sam 29 aout au lieu de jeu 27 - ven 28).
- Retest final decale au dimanche 30 aout.
- Nouvelle section 8 : risques et plan de repli si le chantier
  Supabase prend du retard, avec point de decision au point d'equipe
  du mercredi 26 aout plutot que d'attendre vendredi.
</commit_message>
<xml_diff>
--- a/docs/Plan_Semaine_Marge_Correctifs.docx
+++ b/docs/Plan_Semaine_Marge_Correctifs.docx
@@ -101,147 +101,45 @@
         <w:rPr>
           <w:color w:val="1B2A4A"/>
         </w:rPr>
-        <w:t>1. Décision préalable — à trancher en équipe avant de coder</w:t>
+        <w:t>1. Décision préalable — actée le 22 août</w:t>
       </w:r>
     </w:p>
-    <w:tbl>
-      <w:tblPr>
-        <w:tblStyle w:val="TableGrid"/>
-        <w:tblW w:type="auto" w:w="0"/>
-        <w:jc w:val="center"/>
-        <w:tblLook w:firstColumn="1" w:firstRow="1" w:lastColumn="0" w:lastRow="0" w:noHBand="0" w:noVBand="1" w:val="04A0"/>
-      </w:tblPr>
-      <w:tblGrid>
-        <w:gridCol w:w="2160"/>
-        <w:gridCol w:w="2160"/>
-        <w:gridCol w:w="2160"/>
-        <w:gridCol w:w="2160"/>
-      </w:tblGrid>
-      <w:tr>
-        <w:tc>
-          <w:tcPr>
-            <w:tcW w:type="dxa" w:w="4252"/>
-            <w:shd w:val="clear" w:color="auto" w:fill="1B2A4A"/>
-          </w:tcPr>
-          <w:p>
-            <w:r/>
-            <w:r>
-              <w:rPr>
-                <w:b/>
-                <w:color w:val="FFFFFF"/>
-              </w:rPr>
-              <w:t>Tâche</w:t>
-            </w:r>
-          </w:p>
-        </w:tc>
-        <w:tc>
-          <w:tcPr>
-            <w:tcW w:type="dxa" w:w="1814"/>
-            <w:shd w:val="clear" w:color="auto" w:fill="1B2A4A"/>
-          </w:tcPr>
-          <w:p>
-            <w:r/>
-            <w:r>
-              <w:rPr>
-                <w:b/>
-                <w:color w:val="FFFFFF"/>
-              </w:rPr>
-              <w:t>Qui</w:t>
-            </w:r>
-          </w:p>
-        </w:tc>
-        <w:tc>
-          <w:tcPr>
-            <w:tcW w:type="dxa" w:w="1020"/>
-            <w:shd w:val="clear" w:color="auto" w:fill="1B2A4A"/>
-          </w:tcPr>
-          <w:p>
-            <w:r/>
-            <w:r>
-              <w:rPr>
-                <w:b/>
-                <w:color w:val="FFFFFF"/>
-              </w:rPr>
-              <w:t>Quand</w:t>
-            </w:r>
-          </w:p>
-        </w:tc>
-        <w:tc>
-          <w:tcPr>
-            <w:tcW w:type="dxa" w:w="3685"/>
-            <w:shd w:val="clear" w:color="auto" w:fill="1B2A4A"/>
-          </w:tcPr>
-          <w:p>
-            <w:r/>
-            <w:r>
-              <w:rPr>
-                <w:b/>
-                <w:color w:val="FFFFFF"/>
-              </w:rPr>
-              <w:t>But de la tâche</w:t>
-            </w:r>
-          </w:p>
-        </w:tc>
-      </w:tr>
-      <w:tr>
-        <w:tc>
-          <w:tcPr>
-            <w:tcW w:type="dxa" w:w="4252"/>
-          </w:tcPr>
-          <w:p>
-            <w:r/>
-            <w:r>
-              <w:rPr>
-                <w:sz w:val="20"/>
-              </w:rPr>
-              <w:t>Clarifier ce que « dashboard et historique dynamiques » veut dire concrètement : données vivantes pendant la session en cours seulement, ou vraie persistance entre deux démonstrations/redéploiements ?</w:t>
-            </w:r>
-          </w:p>
-        </w:tc>
-        <w:tc>
-          <w:tcPr>
-            <w:tcW w:type="dxa" w:w="1814"/>
-          </w:tcPr>
-          <w:p>
-            <w:r/>
-            <w:r>
-              <w:rPr>
-                <w:sz w:val="20"/>
-              </w:rPr>
-              <w:t>Toute l'équipe</w:t>
-            </w:r>
-          </w:p>
-        </w:tc>
-        <w:tc>
-          <w:tcPr>
-            <w:tcW w:type="dxa" w:w="1020"/>
-          </w:tcPr>
-          <w:p>
-            <w:r/>
-            <w:r>
-              <w:rPr>
-                <w:sz w:val="20"/>
-              </w:rPr>
-              <w:t>Dim 23 août (matin, avant tout code)</w:t>
-            </w:r>
-          </w:p>
-        </w:tc>
-        <w:tc>
-          <w:tcPr>
-            <w:tcW w:type="dxa" w:w="3685"/>
-          </w:tcPr>
-          <w:p>
-            <w:r/>
-            <w:r>
-              <w:rPr>
-                <w:sz w:val="20"/>
-              </w:rPr>
-              <w:t>Streamlit Community Cloud a un système de fichiers éphémère — un fichier SQLite local est réinitialisé à chaque redéploiement. Coder le branchement sans avoir tranché ce point ferait perdre du temps ou créerait de fausses attentes pour la soutenance.</w:t>
-            </w:r>
-          </w:p>
-        </w:tc>
-      </w:tr>
-    </w:tbl>
+    <w:p>
+      <w:r>
+        <w:rPr>
+          <w:b w:val="0"/>
+          <w:i w:val="0"/>
+        </w:rPr>
+        <w:t>Décision de l'équipe : vraie persistance. Chaque analyse réalisée doit être enregistrée en base, pour alimenter le dashboard et l'historique — pas seulement pendant la session en cours.</w:t>
+      </w:r>
+    </w:p>
+    <w:p>
+      <w:r>
+        <w:rPr>
+          <w:b/>
+          <w:i w:val="0"/>
+        </w:rPr>
+        <w:t>Conséquence technique importante : Streamlit Community Cloud a un système de fichiers éphémère — un fichier SQLite local (comme app/data/scoring_credit.db aujourd'hui) est réinitialisé à chaque redéploiement. Une vraie persistance nécessite donc une base hébergée à l'extérieur de Streamlit Cloud, à laquelle l'application se connecte à distance.</w:t>
+      </w:r>
+    </w:p>
+    <w:p>
+      <w:r>
+        <w:rPr>
+          <w:b w:val="0"/>
+          <w:i w:val="0"/>
+        </w:rPr>
+        <w:t>Solution retenue : Supabase (Postgres hébergé, offre gratuite, connexion simple depuis Python). Le schéma déjà conçu par Marie-Thérèse (tables agents et demandes) s'y transpose directement, sans redesign — seule la couche de connexion change (identifiants gérés via st.secrets, jamais en dur dans le code).</w:t>
+      </w:r>
+    </w:p>
+    <w:p>
+      <w:r>
+        <w:rPr>
+          <w:b w:val="0"/>
+          <w:i/>
+        </w:rPr>
+        <w:t>Ce choix ajoute du travail réel par rapport à la version initiale de ce plan (création du projet Supabase, migration du schéma, gestion des secrets) : le calendrier ci-dessous en tient compte, avec une marge de fin de semaine plus courte que prévu initialement (voir section 8 — risques).</w:t>
+      </w:r>
+    </w:p>
     <w:p/>
     <w:p>
       <w:pPr>
@@ -354,7 +252,7 @@
               <w:rPr>
                 <w:sz w:val="20"/>
               </w:rPr>
-              <w:t>Consolider les 2 fichiers .db dupliqués (app/data/scoring_credit.db et app/scoring_cameroun.db, schémas légèrement différents) en un seul.</w:t>
+              <w:t>Créer le projet Supabase, migrer le schéma existant (tables agents et demandes, consolidées depuis les 2 fichiers SQLite locaux) en Postgres hébergé, configurer les identifiants de connexion via st.secrets.</w:t>
             </w:r>
           </w:p>
         </w:tc>
@@ -382,7 +280,7 @@
               <w:rPr>
                 <w:sz w:val="20"/>
               </w:rPr>
-              <w:t>0,5 j</w:t>
+              <w:t>1 j</w:t>
             </w:r>
           </w:p>
         </w:tc>
@@ -396,7 +294,7 @@
               <w:rPr>
                 <w:sz w:val="20"/>
               </w:rPr>
-              <w:t>Éviter de brancher l'authentification sur une base qui sera ensuite remplacée — partir d'un schéma unique et définitif.</w:t>
+              <w:t>Base hébergée nécessaire pour une vraie persistance sur Streamlit Cloud (voir section 1). Remplace la simple consolidation des 2 .db prévue dans la version précédente de ce plan — désormais migrés vers Supabase plutôt que fusionnés localement.</w:t>
             </w:r>
           </w:p>
         </w:tc>
@@ -412,7 +310,7 @@
               <w:rPr>
                 <w:sz w:val="20"/>
               </w:rPr>
-              <w:t>Brancher l'écran de connexion sur la table agents (identifiant + mot de passe déjà hachés en SHA-256) et ajouter l'écran d'inscription, avec gestion des erreurs et redirection vers le dashboard.</w:t>
+              <w:t>Brancher l'écran de connexion sur la table agents (identifiant + mot de passe déjà hachés en SHA-256) hébergée sur Supabase, et ajouter l'écran d'inscription, avec gestion des erreurs et redirection vers le dashboard.</w:t>
             </w:r>
           </w:p>
         </w:tc>
@@ -470,7 +368,7 @@
               <w:rPr>
                 <w:sz w:val="20"/>
               </w:rPr>
-              <w:t>Rendre le dashboard et la page historique dynamiques : chaque demande analysée est enregistrée dans la table demandes, les visuels/tableaux lisent depuis la base plutôt que depuis les données de démo codées en dur.</w:t>
+              <w:t>Rendre le dashboard et la page historique dynamiques : chaque demande analysée est enregistrée dans la table demandes sur Supabase, les visuels/tableaux lisent depuis la base plutôt que depuis les données de démo codées en dur.</w:t>
             </w:r>
           </w:p>
         </w:tc>
@@ -498,7 +396,7 @@
               <w:rPr>
                 <w:sz w:val="20"/>
               </w:rPr>
-              <w:t>2 j</w:t>
+              <w:t>2,5 j</w:t>
             </w:r>
           </w:p>
         </w:tc>
@@ -512,7 +410,7 @@
               <w:rPr>
                 <w:sz w:val="20"/>
               </w:rPr>
-              <w:t>Remplacer les données factices (get_historique_demandes()) par un vrai suivi des demandes traitées — portée et limites cadrées par la décision de la section 1.</w:t>
+              <w:t>Remplacer les données factices (get_historique_demandes()) par un vrai suivi persistant des demandes traitées. Durée revue a la hausse (+0,5 j par rapport a la premiere version du plan) : premiere integration d'une base distante, plus de risque d'imprevu que du SQLite local.</w:t>
             </w:r>
           </w:p>
         </w:tc>
@@ -542,7 +440,7 @@
               <w:rPr>
                 <w:sz w:val="20"/>
               </w:rPr>
-              <w:t>Jeu 27 août</w:t>
+              <w:t>Ven 28 août (matin)</w:t>
             </w:r>
           </w:p>
         </w:tc>
@@ -987,7 +885,7 @@
               <w:rPr>
                 <w:sz w:val="20"/>
               </w:rPr>
-              <w:t>Jeu 27 – Ven 28 août</w:t>
+              <w:t>Ven 28 août (après-midi) – Sam 29 août</w:t>
             </w:r>
           </w:p>
         </w:tc>
@@ -1015,7 +913,7 @@
               <w:rPr>
                 <w:sz w:val="20"/>
               </w:rPr>
-              <w:t>Volontairement placé après les chantiers de Marie-Thérèse et Andy (section 5) : cette tâche traverse tout app_v2.py, donc plus sûre une fois leurs modifications structurantes déjà fusionnées.</w:t>
+              <w:t>Volontairement placé après les chantiers de Marie-Thérèse et Andy (section 5) : cette tâche traverse tout app_v2.py, donc plus sûre une fois leurs modifications structurantes déjà fusionnées. Décalé d'une demi-journée par rapport a la premiere version du plan, le bloc Supabase de Marie-Thérèse se terminant désormais vendredi matin.</w:t>
             </w:r>
           </w:p>
         </w:tc>
@@ -1045,7 +943,7 @@
               <w:rPr>
                 <w:sz w:val="20"/>
               </w:rPr>
-              <w:t>Ven 28 août</w:t>
+              <w:t>Sam 29 août</w:t>
             </w:r>
           </w:p>
         </w:tc>
@@ -1103,7 +1001,7 @@
               <w:rPr>
                 <w:sz w:val="20"/>
               </w:rPr>
-              <w:t>Ven 28 août</w:t>
+              <w:t>Sam 29 août</w:t>
             </w:r>
           </w:p>
         </w:tc>
@@ -1161,7 +1059,7 @@
               <w:rPr>
                 <w:sz w:val="20"/>
               </w:rPr>
-              <w:t>Ven 28 août</w:t>
+              <w:t>Sam 29 août</w:t>
             </w:r>
           </w:p>
         </w:tc>
@@ -1219,7 +1117,7 @@
               <w:rPr>
                 <w:sz w:val="20"/>
               </w:rPr>
-              <w:t>Ven 28 août, une fois le bug du score confirmé résolu</w:t>
+              <w:t>Sam 29 août, une fois le bug du score confirmé résolu</w:t>
             </w:r>
           </w:p>
         </w:tc>
@@ -1263,7 +1161,7 @@
               <w:rPr>
                 <w:sz w:val="20"/>
               </w:rPr>
-              <w:t>Retester le parcours complet (connexion → nouvelle demande → résultats → export PDF) après intégration de TOUS les correctifs de l'équipe, sur l'app déployée.</w:t>
+              <w:t>Retester le parcours complet (connexion → nouvelle demande → résultats → export PDF, y compris la persistance Supabase) après intégration de TOUS les correctifs de l'équipe, sur l'app déployée.</w:t>
             </w:r>
           </w:p>
         </w:tc>
@@ -1277,7 +1175,7 @@
               <w:rPr>
                 <w:sz w:val="20"/>
               </w:rPr>
-              <w:t>Sam 29 août</w:t>
+              <w:t>Dim 30 août</w:t>
             </w:r>
           </w:p>
         </w:tc>
@@ -1328,7 +1226,7 @@
         <w:pStyle w:val="ListBullet"/>
       </w:pPr>
       <w:r>
-        <w:t>Ne pas commencer le branchement base de données (Marie-Thérèse) avant que la décision de la section 1 (persistance) soit actée en équipe — risque de coder pour rien ou de mal cadrer la fonctionnalité.</w:t>
+        <w:t>La décision de persistance (section 1) est actée — Marie-Thérèse peut démarrer directement la création du projet Supabase dimanche, sans attendre de validation supplémentaire.</w:t>
       </w:r>
     </w:p>
     <w:p>
@@ -1373,7 +1271,7 @@
           <w:b w:val="0"/>
           <w:i w:val="0"/>
         </w:rPr>
-        <w:t>Mercredi 26 août : point d'avancement à mi-semaine — vérifier que les 3 chantiers convergent sans conflit majeur sur app_v2.py, et ajuster le planning des derniers jours (27-29 août) si un des blocs a pris du retard (le bloc de Marie-Thérèse, le plus conséquent, est le plus à risque de déborder).</w:t>
+        <w:t>Mercredi 26 août : point d'avancement à mi-semaine — vérifier en priorité que la migration Supabase (Marie-Thérèse) tient le calendrier, puisque c'est elle qui conditionne le démarrage de l'intégration du style (Aristide) et la marge de fin de semaine. Si retard constaté, décider immédiatement du repli prévu en section 8 plutôt que d'attendre vendredi.</w:t>
       </w:r>
     </w:p>
     <w:p/>
@@ -1402,7 +1300,7 @@
         <w:pStyle w:val="ListBullet"/>
       </w:pPr>
       <w:r>
-        <w:t>authentification réelle (connexion + inscription) et limite de persistance clarifiée et documentée (pas juste codée en silence) ;</w:t>
+        <w:t>authentification réelle (connexion + inscription) branchée sur Supabase ;</w:t>
       </w:r>
     </w:p>
     <w:p>
@@ -1410,7 +1308,7 @@
         <w:pStyle w:val="ListBullet"/>
       </w:pPr>
       <w:r>
-        <w:t>dashboard et historique connectés à de vraies données (dans la limite actée en section 1) ;</w:t>
+        <w:t>dashboard et historique connectés à de vraies données, persistantes entre deux redéploiements (section 1) ;</w:t>
       </w:r>
     </w:p>
     <w:p>
@@ -1450,7 +1348,7 @@
         <w:pStyle w:val="ListBullet"/>
       </w:pPr>
       <w:r>
-        <w:t>parcours complet retesté sans régression.</w:t>
+        <w:t>parcours complet retesté sans régression, y compris la persistance Supabase.</w:t>
       </w:r>
     </w:p>
     <w:p>
@@ -1459,7 +1357,52 @@
           <w:b w:val="0"/>
           <w:i/>
         </w:rPr>
-        <w:t>Marge samedi 29 – dimanche 31 août réservée, comme prévu initialement, à la rédaction/finalisation du rapport académique et à la préparation de la soutenance — pas à de nouveaux correctifs, sauf urgence critique découverte au retest du 28 août.</w:t>
+        <w:t>Marge réduite à la soirée du 30 et au 31 août pour la rédaction/finalisation du rapport académique et la préparation de la soutenance — nettement plus courte que la marge initialement prévue (29-31 août), du fait du travail supplémentaire qu'impose une vraie persistance (section 1 et 8). Pas de nouveaux correctifs après le 30 août, sauf urgence critique découverte au retest.</w:t>
+      </w:r>
+    </w:p>
+    <w:p/>
+    <w:p>
+      <w:pPr>
+        <w:pStyle w:val="Heading1"/>
+      </w:pPr>
+      <w:r>
+        <w:rPr>
+          <w:color w:val="1B2A4A"/>
+        </w:rPr>
+        <w:t>8. Risques et plan de repli</w:t>
+      </w:r>
+    </w:p>
+    <w:p>
+      <w:r>
+        <w:rPr>
+          <w:b w:val="0"/>
+          <w:i w:val="0"/>
+        </w:rPr>
+        <w:t>Le choix d'une vraie persistance (section 1) est la bonne décision sur le fond, mais elle consomme une partie de la marge qui restait avant la deadline du 31 août — la migration vers Supabase est un chantier d'infrastructure nouveau pour l'équipe, avec plus d'inconnues qu'un simple fichier SQLite local.</w:t>
+      </w:r>
+    </w:p>
+    <w:p>
+      <w:pPr>
+        <w:pStyle w:val="ListBullet"/>
+      </w:pPr>
+      <w:r>
+        <w:t>Point de vigilance principal : le bloc Supabase de Marie-Thérèse (sections 1 et 2) est sur le chemin critique — tout retard s'y répercute directement sur le début du travail d'Aristide, puis sur la marge de fin de semaine.</w:t>
+      </w:r>
+    </w:p>
+    <w:p>
+      <w:pPr>
+        <w:pStyle w:val="ListBullet"/>
+      </w:pPr>
+      <w:r>
+        <w:t>Plan de repli si retard constaté au point d'équipe du mercredi 26 août : limiter la persistance Supabase à la table demandes (l'essentiel pour le dashboard/historique) et reporter l'authentification réelle sur Supabase après le 31 août si nécessaire, en gardant temporairement l'authentification actuelle. Décision à prendre en équipe à ce moment-là, pas unilatéralement.</w:t>
+      </w:r>
+    </w:p>
+    <w:p>
+      <w:pPr>
+        <w:pStyle w:val="ListBullet"/>
+      </w:pPr>
+      <w:r>
+        <w:t>Ne pas sacrifier le retest final (section 4, dimanche 30 août) pour gagner du temps ailleurs : une régression non détectée avant la soutenance coûte plus cher qu'un correctif esthétique manquant.</w:t>
       </w:r>
     </w:p>
     <w:sectPr>

</xml_diff>